<commit_message>
fix(docx,serafin,jats): support docx in serafin and jats; update template
</commit_message>
<xml_diff>
--- a/profiles/docs/templates/docx/documentation.docx
+++ b/profiles/docs/templates/docx/documentation.docx
@@ -950,6 +950,71 @@
       <w:spacing w:val="5"/>
     </w:rPr>
   </w:style>
+  <w:style w:type="character" w:customStyle="1" w:styleId="Button">
+    <w:name w:val="Button"/>
+    <w:basedOn w:val="Absatz-Standardschriftart"/>
+    <w:uiPriority w:val="1"/>
+    <w:qFormat/>
+    <w:rsid w:val="00B55057"/>
+    <w:rPr>
+      <w:color w:val="000000" w:themeColor="text1"/>
+      <w:bdr w:val="single" w:sz="8" w:space="0" w:color="auto" w:shadow="1"/>
+      <w:shd w:val="clear" w:color="auto" w:fill="FFC000"/>
+    </w:rPr>
+  </w:style>
+  <w:style w:type="character" w:customStyle="1" w:styleId="Label">
+    <w:name w:val="Label"/>
+    <w:basedOn w:val="Absatz-Standardschriftart"/>
+    <w:uiPriority w:val="1"/>
+    <w:qFormat/>
+    <w:rsid w:val="00B55057"/>
+    <w:rPr>
+      <w:rFonts w:cs="Times New Roman (Textkörper CS)"/>
+      <w:color w:val="FFC000"/>
+      <w:u w:color="FFC000"/>
+    </w:rPr>
+  </w:style>
+  <w:style w:type="paragraph" w:styleId="Beschriftung">
+    <w:name w:val="caption"/>
+    <w:basedOn w:val="Standard"/>
+    <w:next w:val="Standard"/>
+    <w:uiPriority w:val="35"/>
+    <w:unhideWhenUsed/>
+    <w:qFormat/>
+    <w:rsid w:val="00BC29B5"/>
+    <w:pPr>
+      <w:spacing w:after="200" w:line="240" w:lineRule="auto"/>
+      <w:jc w:val="right"/>
+    </w:pPr>
+    <w:rPr>
+      <w:i/>
+      <w:iCs/>
+      <w:color w:val="0E2841" w:themeColor="text2"/>
+      <w:sz w:val="18"/>
+      <w:szCs w:val="18"/>
+    </w:rPr>
+  </w:style>
+  <w:style w:type="paragraph" w:customStyle="1" w:styleId="Code">
+    <w:name w:val="Code"/>
+    <w:basedOn w:val="KeinLeerraum"/>
+    <w:qFormat/>
+    <w:rsid w:val="003B5C5A"/>
+    <w:pPr>
+      <w:spacing w:after="240"/>
+    </w:pPr>
+    <w:rPr>
+      <w:rFonts w:ascii="Consolas" w:hAnsi="Consolas"/>
+    </w:rPr>
+  </w:style>
+  <w:style w:type="paragraph" w:styleId="KeinLeerraum">
+    <w:name w:val="No Spacing"/>
+    <w:uiPriority w:val="1"/>
+    <w:qFormat/>
+    <w:rsid w:val="003B5C5A"/>
+    <w:pPr>
+      <w:spacing w:after="0" w:line="240" w:lineRule="auto"/>
+    </w:pPr>
+  </w:style>
 </w:styles>
 </file>
 

</xml_diff>